<commit_message>
Rebuild printable worksheets after the argument-section content change
Co-Authored-By: Claude Fable 5.1 <noreply@anthropic.com>
</commit_message>
<xml_diff>
--- a/public/print/vayikra-16-1.docx
+++ b/public/print/vayikra-16-1.docx
@@ -1654,6 +1654,385 @@
           <w:rtl/>
         </w:rPr>
         <w:t xml:space="preserve">קראו בקול נמוך את פסוקים ז׳–ח׳: עצירה קטנה במילת האתנחתא, ועצירה ארוכה בסוף כל פסוק. איזו מילה הייתה הכי קשה לכם לקרוא? כתבו את המילה. אם אתם יודעים מה פירושה — כתבו גם את הפירוש.</w:t>
+      </w:r>
+    </w:p>
+    <w:p>
+      <w:pPr>
+        <w:pBdr>
+          <w:bottom w:val="single" w:color="BDBDBD" w:sz="6" w:space="1"/>
+        </w:pBdr>
+        <w:bidi/>
+        <w:spacing w:after="0" w:before="0" w:line="480"/>
+        <w:jc w:val="right"/>
+      </w:pPr>
+      <w:r>
+        <w:rPr>
+          <w:rFonts w:ascii="Arial" w:cs="Arial" w:eastAsia="Arial" w:hAnsi="Arial"/>
+          <w:sz w:val="23"/>
+          <w:szCs w:val="23"/>
+          <w:rtl/>
+        </w:rPr>
+        <w:t xml:space="preserve"> </w:t>
+      </w:r>
+    </w:p>
+    <w:p>
+      <w:pPr>
+        <w:pBdr>
+          <w:bottom w:val="single" w:color="BDBDBD" w:sz="6" w:space="1"/>
+        </w:pBdr>
+        <w:bidi/>
+        <w:spacing w:after="0" w:before="0" w:line="480"/>
+        <w:jc w:val="right"/>
+      </w:pPr>
+      <w:r>
+        <w:rPr>
+          <w:rFonts w:ascii="Arial" w:cs="Arial" w:eastAsia="Arial" w:hAnsi="Arial"/>
+          <w:sz w:val="23"/>
+          <w:szCs w:val="23"/>
+          <w:rtl/>
+        </w:rPr>
+        <w:t xml:space="preserve"> </w:t>
+      </w:r>
+    </w:p>
+    <w:p>
+      <w:pPr>
+        <w:pBdr>
+          <w:bottom w:val="single" w:color="BDBDBD" w:sz="6" w:space="1"/>
+        </w:pBdr>
+        <w:bidi/>
+        <w:spacing w:after="0" w:before="0" w:line="480"/>
+        <w:jc w:val="right"/>
+      </w:pPr>
+      <w:r>
+        <w:rPr>
+          <w:rFonts w:ascii="Arial" w:cs="Arial" w:eastAsia="Arial" w:hAnsi="Arial"/>
+          <w:sz w:val="23"/>
+          <w:szCs w:val="23"/>
+          <w:rtl/>
+        </w:rPr>
+        <w:t xml:space="preserve"> </w:t>
+      </w:r>
+    </w:p>
+    <w:p>
+      <w:pPr>
+        <w:keepNext/>
+        <w:bidi/>
+        <w:spacing w:after="100" w:before="280"/>
+        <w:jc w:val="right"/>
+      </w:pPr>
+      <w:r>
+        <w:rPr>
+          <w:rFonts w:ascii="Arial" w:cs="Arial" w:eastAsia="Arial" w:hAnsi="Arial"/>
+          <w:b/>
+          <w:bCs/>
+          <w:color w:val="413055"/>
+          <w:sz w:val="27"/>
+          <w:szCs w:val="27"/>
+          <w:rtl/>
+        </w:rPr>
+        <w:t xml:space="preserve">בניית טיעון — לקראת הדיון</w:t>
+      </w:r>
+    </w:p>
+    <w:p>
+      <w:pPr>
+        <w:keepNext/>
+        <w:bidi/>
+        <w:spacing w:after="100" w:line="340"/>
+        <w:jc w:val="right"/>
+      </w:pPr>
+      <w:r>
+        <w:rPr>
+          <w:rFonts w:ascii="Arial" w:cs="Arial" w:eastAsia="Arial" w:hAnsi="Arial"/>
+          <w:color w:val="555555"/>
+          <w:sz w:val="21"/>
+          <w:szCs w:val="21"/>
+          <w:rtl/>
+        </w:rPr>
+        <w:t xml:space="preserve">בשיעור הבא נפתח בדיון כיתתי על השאלה שלמטה. כאן אתם בונים את העמדה שלכם בכתב, בשלושה חלקים — טענה, נימוק וביסוס מהפסוקים — ומי שמסיים את המשימה מקבל כרטיס כניסה לדיון.</w:t>
+      </w:r>
+    </w:p>
+    <w:p>
+      <w:pPr>
+        <w:keepNext/>
+        <w:keepLines/>
+        <w:bidi/>
+        <w:spacing w:after="60" w:before="120"/>
+        <w:jc w:val="right"/>
+      </w:pPr>
+      <w:r>
+        <w:rPr>
+          <w:rFonts w:ascii="Arial" w:cs="Arial" w:eastAsia="Arial" w:hAnsi="Arial"/>
+          <w:b/>
+          <w:bCs/>
+          <w:color w:val="413055"/>
+          <w:sz w:val="23"/>
+          <w:szCs w:val="23"/>
+          <w:rtl/>
+        </w:rPr>
+        <w:t xml:space="preserve">9. </w:t>
+      </w:r>
+      <w:r>
+        <w:rPr>
+          <w:rFonts w:ascii="Arial" w:cs="Arial" w:eastAsia="Arial" w:hAnsi="Arial"/>
+          <w:sz w:val="23"/>
+          <w:szCs w:val="23"/>
+          <w:rtl/>
+        </w:rPr>
+        <w:t xml:space="preserve">בפסוק ח׳ לא אהרן מחליט איזה שעיר יהיה לה׳ ואיזה לעזאזל — הגורל מחליט. האם זו הדרך הכי צודקת להכריע בין שניים שווים, או שמנהיג צריך להחליט בעצמו ולשאת באחריות? — מה העמדה שלך?</w:t>
+      </w:r>
+    </w:p>
+    <w:p>
+      <w:pPr>
+        <w:keepNext/>
+        <w:bidi/>
+        <w:spacing w:after="100" w:line="340"/>
+        <w:jc w:val="right"/>
+      </w:pPr>
+      <w:r>
+        <w:rPr>
+          <w:rFonts w:ascii="Arial" w:cs="Arial" w:eastAsia="Arial" w:hAnsi="Arial"/>
+          <w:color w:val="666666"/>
+          <w:sz w:val="20"/>
+          <w:szCs w:val="20"/>
+          <w:rtl/>
+        </w:rPr>
+        <w:t xml:space="preserve">טענה = מה אני חושב/ת · נימוק = למה · ביסוס = איפה זה כתוב בפסוקים (ציטוט + מספר פסוק)</w:t>
+      </w:r>
+    </w:p>
+    <w:p>
+      <w:pPr>
+        <w:keepNext/>
+        <w:bidi/>
+        <w:spacing w:after="20" w:before="60"/>
+        <w:jc w:val="right"/>
+      </w:pPr>
+      <w:r>
+        <w:rPr>
+          <w:rFonts w:ascii="Arial" w:cs="Arial" w:eastAsia="Arial" w:hAnsi="Arial"/>
+          <w:color w:val="413055"/>
+          <w:sz w:val="21"/>
+          <w:szCs w:val="21"/>
+          <w:rtl/>
+        </w:rPr>
+        <w:t xml:space="preserve">הטענה שלי</w:t>
+      </w:r>
+    </w:p>
+    <w:p>
+      <w:pPr>
+        <w:pBdr>
+          <w:bottom w:val="single" w:color="BDBDBD" w:sz="6" w:space="1"/>
+        </w:pBdr>
+        <w:bidi/>
+        <w:spacing w:after="0" w:before="0" w:line="480"/>
+        <w:jc w:val="right"/>
+      </w:pPr>
+      <w:r>
+        <w:rPr>
+          <w:rFonts w:ascii="Arial" w:cs="Arial" w:eastAsia="Arial" w:hAnsi="Arial"/>
+          <w:sz w:val="23"/>
+          <w:szCs w:val="23"/>
+          <w:rtl/>
+        </w:rPr>
+        <w:t xml:space="preserve"> </w:t>
+      </w:r>
+    </w:p>
+    <w:p>
+      <w:pPr>
+        <w:pBdr>
+          <w:bottom w:val="single" w:color="BDBDBD" w:sz="6" w:space="1"/>
+        </w:pBdr>
+        <w:bidi/>
+        <w:spacing w:after="0" w:before="0" w:line="480"/>
+        <w:jc w:val="right"/>
+      </w:pPr>
+      <w:r>
+        <w:rPr>
+          <w:rFonts w:ascii="Arial" w:cs="Arial" w:eastAsia="Arial" w:hAnsi="Arial"/>
+          <w:sz w:val="23"/>
+          <w:szCs w:val="23"/>
+          <w:rtl/>
+        </w:rPr>
+        <w:t xml:space="preserve"> </w:t>
+      </w:r>
+    </w:p>
+    <w:p>
+      <w:pPr>
+        <w:keepNext/>
+        <w:bidi/>
+        <w:spacing w:after="20" w:before="60"/>
+        <w:jc w:val="right"/>
+      </w:pPr>
+      <w:r>
+        <w:rPr>
+          <w:rFonts w:ascii="Arial" w:cs="Arial" w:eastAsia="Arial" w:hAnsi="Arial"/>
+          <w:color w:val="413055"/>
+          <w:sz w:val="21"/>
+          <w:szCs w:val="21"/>
+          <w:rtl/>
+        </w:rPr>
+        <w:t xml:space="preserve">הנימוק</w:t>
+      </w:r>
+    </w:p>
+    <w:p>
+      <w:pPr>
+        <w:pBdr>
+          <w:bottom w:val="single" w:color="BDBDBD" w:sz="6" w:space="1"/>
+        </w:pBdr>
+        <w:bidi/>
+        <w:spacing w:after="0" w:before="0" w:line="480"/>
+        <w:jc w:val="right"/>
+      </w:pPr>
+      <w:r>
+        <w:rPr>
+          <w:rFonts w:ascii="Arial" w:cs="Arial" w:eastAsia="Arial" w:hAnsi="Arial"/>
+          <w:sz w:val="23"/>
+          <w:szCs w:val="23"/>
+          <w:rtl/>
+        </w:rPr>
+        <w:t xml:space="preserve"> </w:t>
+      </w:r>
+    </w:p>
+    <w:p>
+      <w:pPr>
+        <w:pBdr>
+          <w:bottom w:val="single" w:color="BDBDBD" w:sz="6" w:space="1"/>
+        </w:pBdr>
+        <w:bidi/>
+        <w:spacing w:after="0" w:before="0" w:line="480"/>
+        <w:jc w:val="right"/>
+      </w:pPr>
+      <w:r>
+        <w:rPr>
+          <w:rFonts w:ascii="Arial" w:cs="Arial" w:eastAsia="Arial" w:hAnsi="Arial"/>
+          <w:sz w:val="23"/>
+          <w:szCs w:val="23"/>
+          <w:rtl/>
+        </w:rPr>
+        <w:t xml:space="preserve"> </w:t>
+      </w:r>
+    </w:p>
+    <w:p>
+      <w:pPr>
+        <w:keepNext/>
+        <w:bidi/>
+        <w:spacing w:after="20" w:before="60"/>
+        <w:jc w:val="right"/>
+      </w:pPr>
+      <w:r>
+        <w:rPr>
+          <w:rFonts w:ascii="Arial" w:cs="Arial" w:eastAsia="Arial" w:hAnsi="Arial"/>
+          <w:color w:val="413055"/>
+          <w:sz w:val="21"/>
+          <w:szCs w:val="21"/>
+          <w:rtl/>
+        </w:rPr>
+        <w:t xml:space="preserve">הביסוס מהפסוקים (ציטוט + פסוק)</w:t>
+      </w:r>
+    </w:p>
+    <w:p>
+      <w:pPr>
+        <w:pBdr>
+          <w:bottom w:val="single" w:color="BDBDBD" w:sz="6" w:space="1"/>
+        </w:pBdr>
+        <w:bidi/>
+        <w:spacing w:after="0" w:before="0" w:line="480"/>
+        <w:jc w:val="right"/>
+      </w:pPr>
+      <w:r>
+        <w:rPr>
+          <w:rFonts w:ascii="Arial" w:cs="Arial" w:eastAsia="Arial" w:hAnsi="Arial"/>
+          <w:sz w:val="23"/>
+          <w:szCs w:val="23"/>
+          <w:rtl/>
+        </w:rPr>
+        <w:t xml:space="preserve"> </w:t>
+      </w:r>
+    </w:p>
+    <w:p>
+      <w:pPr>
+        <w:pBdr>
+          <w:bottom w:val="single" w:color="BDBDBD" w:sz="6" w:space="1"/>
+        </w:pBdr>
+        <w:bidi/>
+        <w:spacing w:after="0" w:before="0" w:line="480"/>
+        <w:jc w:val="right"/>
+      </w:pPr>
+      <w:r>
+        <w:rPr>
+          <w:rFonts w:ascii="Arial" w:cs="Arial" w:eastAsia="Arial" w:hAnsi="Arial"/>
+          <w:sz w:val="23"/>
+          <w:szCs w:val="23"/>
+          <w:rtl/>
+        </w:rPr>
+        <w:t xml:space="preserve"> </w:t>
+      </w:r>
+    </w:p>
+    <w:p>
+      <w:pPr>
+        <w:keepNext/>
+        <w:keepLines/>
+        <w:bidi/>
+        <w:spacing w:after="60" w:before="120"/>
+        <w:jc w:val="right"/>
+      </w:pPr>
+      <w:r>
+        <w:rPr>
+          <w:rFonts w:ascii="Arial" w:cs="Arial" w:eastAsia="Arial" w:hAnsi="Arial"/>
+          <w:b/>
+          <w:bCs/>
+          <w:color w:val="413055"/>
+          <w:sz w:val="23"/>
+          <w:szCs w:val="23"/>
+          <w:rtl/>
+        </w:rPr>
+        <w:t xml:space="preserve">10. </w:t>
+      </w:r>
+      <w:r>
+        <w:rPr>
+          <w:rFonts w:ascii="Arial" w:cs="Arial" w:eastAsia="Arial" w:hAnsi="Arial"/>
+          <w:sz w:val="23"/>
+          <w:szCs w:val="23"/>
+          <w:rtl/>
+        </w:rPr>
+        <w:t xml:space="preserve">מה יגיד מי שחושב הפוך? כתבו את הטענה הכי חזקה של הצד השני — ואיפה בפסוקים היא נשענת.</w:t>
+      </w:r>
+    </w:p>
+    <w:p>
+      <w:pPr>
+        <w:pBdr>
+          <w:bottom w:val="single" w:color="BDBDBD" w:sz="6" w:space="1"/>
+        </w:pBdr>
+        <w:bidi/>
+        <w:spacing w:after="0" w:before="0" w:line="480"/>
+        <w:jc w:val="right"/>
+      </w:pPr>
+      <w:r>
+        <w:rPr>
+          <w:rFonts w:ascii="Arial" w:cs="Arial" w:eastAsia="Arial" w:hAnsi="Arial"/>
+          <w:sz w:val="23"/>
+          <w:szCs w:val="23"/>
+          <w:rtl/>
+        </w:rPr>
+        <w:t xml:space="preserve"> </w:t>
+      </w:r>
+    </w:p>
+    <w:p>
+      <w:pPr>
+        <w:pBdr>
+          <w:bottom w:val="single" w:color="BDBDBD" w:sz="6" w:space="1"/>
+        </w:pBdr>
+        <w:bidi/>
+        <w:spacing w:after="0" w:before="0" w:line="480"/>
+        <w:jc w:val="right"/>
+      </w:pPr>
+      <w:r>
+        <w:rPr>
+          <w:rFonts w:ascii="Arial" w:cs="Arial" w:eastAsia="Arial" w:hAnsi="Arial"/>
+          <w:sz w:val="23"/>
+          <w:szCs w:val="23"/>
+          <w:rtl/>
+        </w:rPr>
+        <w:t xml:space="preserve"> </w:t>
       </w:r>
     </w:p>
     <w:p>

</xml_diff>